<commit_message>
Informe en PDF visible y descargable desde la app, enlace a GitHub
- Informe APA generado también en PDF, con tabla de contenido paginada
- Pestaña Informe con visor de PDF y descarga en PDF y Word
- Enlace al repositorio en el encabezado y el pie de página
- Anotación de la gráfica de silueta reubicada para no tapar la línea
</commit_message>
<xml_diff>
--- a/Informe_APA_Segmentacion_KMeans.docx
+++ b/Informe_APA_Segmentacion_KMeans.docx
@@ -76,7 +76,7 @@
     <w:p>
       <w:r>
         <w:fldChar w:fldCharType="begin"/>
-        <w:instrText xml:space="preserve">TOC \o "1-3" \h \z \u</w:instrText>
+        <w:instrText xml:space="preserve">TOC \o "1-2" \h \z \u</w:instrText>
         <w:fldChar w:fldCharType="separate"/>
         <w:fldChar w:fldCharType="end"/>
       </w:r>
@@ -116,10 +116,10 @@
         <w:rPr>
           <w:i/>
         </w:rPr>
-        <w:t xml:space="preserve">Palabras clave: </w:t>
-      </w:r>
-      <w:r>
-        <w:t>minería de datos, segmentación de clientes, K-Means, coeficiente de silueta, método del codo, Streamlit</w:t>
+        <w:t>Palabras clave:</w:t>
+      </w:r>
+      <w:r>
+        <w:t xml:space="preserve"> minería de datos, segmentación de clientes, K-Means, coeficiente de silueta, método del codo, Streamlit</w:t>
       </w:r>
     </w:p>
     <w:p>
@@ -9149,6 +9149,112 @@
               <w:rPr>
                 <w:sz w:val="22"/>
               </w:rPr>
+              <w:t>Informe_APA_Segmentacion_KMeans.pdf y .docx</w:t>
+            </w:r>
+          </w:p>
+        </w:tc>
+        <w:tc>
+          <w:tcPr>
+            <w:tcW w:type="dxa" w:w="5544"/>
+            <w:tcBorders>
+              <w:top w:val="nil"/>
+              <w:left w:val="nil"/>
+              <w:bottom w:val="nil"/>
+              <w:right w:val="nil"/>
+            </w:tcBorders>
+          </w:tcPr>
+          <w:p>
+            <w:pPr>
+              <w:spacing w:line="240" w:lineRule="auto" w:before="60" w:after="60"/>
+              <w:ind w:firstLine="0"/>
+              <w:jc w:val="left"/>
+            </w:pPr>
+            <w:r>
+              <w:rPr>
+                <w:sz w:val="22"/>
+              </w:rPr>
+              <w:t>Este informe, en PDF (visible en la aplicación) y en Word</w:t>
+            </w:r>
+          </w:p>
+        </w:tc>
+      </w:tr>
+      <w:tr>
+        <w:trPr>
+          <w:cantSplit/>
+        </w:trPr>
+        <w:tc>
+          <w:tcPr>
+            <w:tcW w:type="dxa" w:w="3744"/>
+            <w:tcBorders>
+              <w:top w:val="nil"/>
+              <w:left w:val="nil"/>
+              <w:bottom w:val="nil"/>
+              <w:right w:val="nil"/>
+            </w:tcBorders>
+          </w:tcPr>
+          <w:p>
+            <w:pPr>
+              <w:spacing w:line="240" w:lineRule="auto" w:before="60" w:after="60"/>
+              <w:ind w:firstLine="0"/>
+              <w:jc w:val="left"/>
+            </w:pPr>
+            <w:r>
+              <w:rPr>
+                <w:sz w:val="22"/>
+              </w:rPr>
+              <w:t>fuentes/Inter.ttf</w:t>
+            </w:r>
+          </w:p>
+        </w:tc>
+        <w:tc>
+          <w:tcPr>
+            <w:tcW w:type="dxa" w:w="5544"/>
+            <w:tcBorders>
+              <w:top w:val="nil"/>
+              <w:left w:val="nil"/>
+              <w:bottom w:val="nil"/>
+              <w:right w:val="nil"/>
+            </w:tcBorders>
+          </w:tcPr>
+          <w:p>
+            <w:pPr>
+              <w:spacing w:line="240" w:lineRule="auto" w:before="60" w:after="60"/>
+              <w:ind w:firstLine="0"/>
+              <w:jc w:val="left"/>
+            </w:pPr>
+            <w:r>
+              <w:rPr>
+                <w:sz w:val="22"/>
+              </w:rPr>
+              <w:t>Tipografía Inter de la interfaz y las gráficas (licencia SIL OFL 1.1)</w:t>
+            </w:r>
+          </w:p>
+        </w:tc>
+      </w:tr>
+      <w:tr>
+        <w:trPr>
+          <w:cantSplit/>
+        </w:trPr>
+        <w:tc>
+          <w:tcPr>
+            <w:tcW w:type="dxa" w:w="3744"/>
+            <w:tcBorders>
+              <w:top w:val="nil"/>
+              <w:left w:val="nil"/>
+              <w:bottom w:val="nil"/>
+              <w:right w:val="nil"/>
+            </w:tcBorders>
+          </w:tcPr>
+          <w:p>
+            <w:pPr>
+              <w:spacing w:line="240" w:lineRule="auto" w:before="60" w:after="60"/>
+              <w:ind w:firstLine="0"/>
+              <w:jc w:val="left"/>
+            </w:pPr>
+            <w:r>
+              <w:rPr>
+                <w:sz w:val="22"/>
+              </w:rPr>
               <w:t>requirements.txt</w:t>
             </w:r>
           </w:p>
@@ -9246,7 +9352,7 @@
         <w:ind w:firstLine="720"/>
       </w:pPr>
       <w:r>
-        <w:t>La aplicación cumple con los cuatro requisitos del taller y añade funciones de apoyo. En la parte superior muestra los indicadores del modelo (200 clientes, K = 5, silueta de 0.555 y Davies-Bouldin de 0.572) y organiza el contenido en seis pestañas:</w:t>
+        <w:t>La aplicación cumple con los cuatro requisitos del taller y añade funciones de apoyo. En la parte superior muestra los indicadores del modelo (200 clientes, K = 5, silueta de 0.555 y Davies-Bouldin de 0.572) y organiza el contenido en siete pestañas. Bajo el título incluye un enlace al repositorio de GitHub del proyecto.</w:t>
       </w:r>
     </w:p>
     <w:p>
@@ -9326,6 +9432,20 @@
       </w:r>
       <w:r>
         <w:t xml:space="preserve"> permite subir un archivo CSV con varios clientes y descargar el resultado con el segmento de cada uno.</w:t>
+      </w:r>
+    </w:p>
+    <w:p>
+      <w:pPr>
+        <w:pStyle w:val="ListBullet"/>
+      </w:pPr>
+      <w:r>
+        <w:rPr>
+          <w:b/>
+        </w:rPr>
+        <w:t>Informe:</w:t>
+      </w:r>
+      <w:r>
+        <w:t xml:space="preserve"> muestra este informe en un visor de PDF dentro de la aplicación y permite descargarlo en PDF o en Word.</w:t>
       </w:r>
     </w:p>
     <w:p>
@@ -9618,13 +9738,10 @@
         <w:ind w:firstLine="720"/>
       </w:pPr>
       <w:r>
-        <w:t xml:space="preserve">El código fuente está disponible en: </w:t>
-      </w:r>
-      <w:r>
-        <w:rPr>
-          <w:highlight w:val="yellow"/>
-        </w:rPr>
-        <w:t>[enlace del repositorio de GitHub]</w:t>
+        <w:t xml:space="preserve">El código fuente, el cuaderno y este informe están disponibles en: </w:t>
+      </w:r>
+      <w:r>
+        <w:t>https://github.com/Valery-Rosero/App-Mall-Customer-Data</w:t>
       </w:r>
     </w:p>
     <w:p>

</xml_diff>

<commit_message>
Enlace de la aplicación desplegada en el informe y el README
</commit_message>
<xml_diff>
--- a/Informe_APA_Segmentacion_KMeans.docx
+++ b/Informe_APA_Segmentacion_KMeans.docx
@@ -9727,10 +9727,7 @@
         <w:t xml:space="preserve">La aplicación está disponible en: </w:t>
       </w:r>
       <w:r>
-        <w:rPr>
-          <w:highlight w:val="yellow"/>
-        </w:rPr>
-        <w:t>[enlace de la aplicación]</w:t>
+        <w:t>https://app-mall-customer-data-e7v6nnhgmzxqyhvg6fnjms.streamlit.app/</w:t>
       </w:r>
     </w:p>
     <w:p>

</xml_diff>